<commit_message>
Minimize resident data and require privacy review before distribution
</commit_message>
<xml_diff>
--- a/legal/personal-data-consent.docx
+++ b/legal/personal-data-consent.docx
@@ -7,7 +7,7 @@
         <w:pStyle w:val="Title"/>
       </w:pPr>
       <w:r>
-        <w:t>Согласие на обработку персональных данных</w:t>
+        <w:t>Информация об отключении подтверждения согласия</w:t>
       </w:r>
     </w:p>
     <w:p>
@@ -15,7 +15,7 @@
         <w:jc w:val="both"/>
       </w:pPr>
       <w:r>
-        <w:t>Чат-бот «На связи_регион40» в мессенджере MAX</w:t>
+        <w:t>Редакция 3.0 от 29.09.2026. Чат-бот «На связи_регион40».</w:t>
       </w:r>
     </w:p>
     <w:p>
@@ -23,7 +23,7 @@
         <w:jc w:val="both"/>
       </w:pPr>
       <w:r>
-        <w:t>Редакция 2.0 от 29.09.2026</w:t>
+        <w:t>В текущем сценарии чат-бот не запрашивает подтверждение согласия на обработку персональных данных и не создаёт новые записи о таком подтверждении. Этот файл сохранён по прежнему адресу для совместимости ссылок и не является бланком согласия. Ничего подписывать или подтверждать по этому документу не требуется.</w:t>
       </w:r>
     </w:p>
     <w:p>
@@ -31,15 +31,7 @@
         <w:jc w:val="both"/>
       </w:pPr>
       <w:r>
-        <w:t>Пользователь добровольно, своей волей и в своём интересе даёт Оператору согласие на обработку своих персональных данных для приёма и рассмотрения обращений через Чат-бот на следующих условиях. Согласие предоставляется отдельно от пользовательского соглашения.</w:t>
-      </w:r>
-    </w:p>
-    <w:p>
-      <w:pPr>
-        <w:pStyle w:val="Heading1"/>
-      </w:pPr>
-      <w:r>
-        <w:t>1. Оператор</w:t>
+        <w:t>Профиль жителя с ФИО и телефоном не формируется. Для работы сервиса используются ID MAX, обращение и необходимые служебные сведения. Их состав, цели, получатели и порядок удаления описаны в политике обработки данных. Использование идентификатора не означает полного обезличивания.</w:t>
       </w:r>
     </w:p>
     <w:p>
@@ -47,15 +39,7 @@
         <w:jc w:val="both"/>
       </w:pPr>
       <w:r>
-        <w:t>Министерство цифрового развития Калужской области. ИНН: 4027138814; ОГРН: 1194027000221. Адрес: 248016, Калужская область, г. Калуга, ул. Ленина, д. 14. Электронная почта для запросов и отзыва согласия: min_digital@adm.kaluga.ru.</w:t>
-      </w:r>
-    </w:p>
-    <w:p>
-      <w:pPr>
-        <w:pStyle w:val="Heading1"/>
-      </w:pPr>
-      <w:r>
-        <w:t>2. Цели и данные</w:t>
+        <w:t>Не передавайте ФИО, телефоны, документы, личные контакты и фотографии людей. Текст проверяется автоматически, текст и фото дополнительно проверяет сотрудник перед распределением. Автоматическая проверка может ошибаться. Компетентными получателями могут быть также региональные подразделения Социального фонда России и фонда «Защитники Отечества».</w:t>
       </w:r>
     </w:p>
     <w:p>
@@ -63,7 +47,7 @@
         <w:jc w:val="both"/>
       </w:pPr>
       <w:r>
-        <w:t>2.1. Цели: ведение профиля для подачи и повторного направления обращений; приём, регистрация, рассмотрение и передача обращения компетентной организации; связь с заявителем и доставка ответа; обеспечение надёжности обработки; внутренняя отчётность для организации и контроля рассмотрения обращений.</w:t>
+        <w:t>Отключение кнопки не устанавливает правовое основание обработки автоматически. До запуска оператор обязан определить применимое законное основание и необходимые организационные меры. Если выбранное основание требует согласия, сценарий должен быть приведён в соответствие до начала такой обработки.</w:t>
       </w:r>
     </w:p>
     <w:p>
@@ -71,193 +55,7 @@
         <w:jc w:val="both"/>
       </w:pPr>
       <w:r>
-        <w:t>2.2. Данные: фамилия, имя, отчество при наличии, контактный телефон; идентификатор, отображаемое имя и имя пользователя MAX при передаче этих сведений; идентификаторы чатов, сообщений и действий, дата и время взаимодействия.</w:t>
-      </w:r>
-    </w:p>
-    <w:p>
-      <w:pPr>
-        <w:jc w:val="both"/>
-      </w:pPr>
-      <w:r>
-        <w:t>2.3. Данные обращения: выбранная сфера и территория проблемы, населённый пункт, текст, указанный адрес или описание места, фотографии, номер обращения, сведения о ходе рассмотрения, ответы, причины отклонения и оценка ответа. Материалы могут содержать персональные данные заявителя и третьих лиц и требуют соответствующей защиты. Настоящее согласие относится к данным самого пользователя и не заменяет оснований обработки данных других людей.</w:t>
-      </w:r>
-    </w:p>
-    <w:p>
-      <w:pPr>
-        <w:jc w:val="both"/>
-      </w:pPr>
-      <w:r>
-        <w:t>2.4. Для доказательства согласия сохраняются идентификатор пользователя, дата и время подтверждения, редакция, адрес и контрольная сумма документа, текст подтверждения и идентификаторы подтверждающего действия MAX. Технические очереди могут содержать данные сообщений для обеспечения их обработки и доставки.</w:t>
-      </w:r>
-    </w:p>
-    <w:p>
-      <w:pPr>
-        <w:pStyle w:val="Heading1"/>
-      </w:pPr>
-      <w:r>
-        <w:t>3. Действия и способы обработки</w:t>
-      </w:r>
-    </w:p>
-    <w:p>
-      <w:pPr>
-        <w:jc w:val="both"/>
-      </w:pPr>
-      <w:r>
-        <w:t>3.1. Разрешаются сбор, запись, систематизация, накопление, хранение, уточнение, извлечение, использование, передача компетентному получателю и предоставление доступа, блокирование, обезличивание, удаление и уничтожение в указанных целях. Обработка осуществляется автоматизированно и сотрудниками без использования средств автоматизации.</w:t>
-      </w:r>
-    </w:p>
-    <w:p>
-      <w:pPr>
-        <w:jc w:val="both"/>
-      </w:pPr>
-      <w:r>
-        <w:t>3.2. ФИО и телефон сохраняются в профиле для следующих обращений и могут быть исправлены перед отправкой. Данные включаются в карточки обращения и внутренние отчёты; такие отчёты не являются автоматически обезличенными. Публичное распространение персональных данных настоящим согласием не разрешается.</w:t>
-      </w:r>
-    </w:p>
-    <w:p>
-      <w:pPr>
-        <w:pStyle w:val="Heading1"/>
-        <w:pageBreakBefore/>
-      </w:pPr>
-      <w:r>
-        <w:t>4. Получатели и среда обработки</w:t>
-      </w:r>
-    </w:p>
-    <w:p>
-      <w:pPr>
-        <w:jc w:val="both"/>
-      </w:pPr>
-      <w:r>
-        <w:t>4.1. Доступ в необходимом объёме предоставляется уполномоченным сотрудникам Оператора, распределения, ответственной организации и согласования. Работа возможна в закрытых рабочих чатах MAX и предусмотренных Чат-ботом личных рабочих диалогах сотрудников.</w:t>
-      </w:r>
-    </w:p>
-    <w:p>
-      <w:pPr>
-        <w:jc w:val="both"/>
-      </w:pPr>
-      <w:r>
-        <w:t>4.2. Обращение может направляться компетентным государственным органам, органам местного самоуправления, соответствующим подразделениям Социального фонда России и Государственного фонда поддержки участников специальной военной операции «Защитники Отечества» для рассмотрения вопроса и при наличии законного основания. Сведения о конкретном получателе доступны по запросу Оператору.</w:t>
-      </w:r>
-    </w:p>
-    <w:p>
-      <w:pPr>
-        <w:jc w:val="both"/>
-      </w:pPr>
-      <w:r>
-        <w:t>4.3. Для передачи сообщений используется MAX. Фотографии могут храниться в MAX, а в системе Оператора сохраняются ссылки на них. Обработка самим MAX регулируется его документами. Технические исполнители могут привлекаться только на законном основании и в необходимом объёме. Оператор обеспечивает размещение подконтрольных баз, файлов и резервных копий в Российской Федерации.</w:t>
-      </w:r>
-    </w:p>
-    <w:p>
-      <w:pPr>
-        <w:pStyle w:val="Heading1"/>
-      </w:pPr>
-      <w:r>
-        <w:t>5. Срок действия и хранения</w:t>
-      </w:r>
-    </w:p>
-    <w:p>
-      <w:pPr>
-        <w:jc w:val="both"/>
-      </w:pPr>
-      <w:r>
-        <w:t>5.1. Согласие действует для обработки поданных и последующих обращений в рамках указанных целей до отзыва. Данные каждого завершённого обращения подлежат хранению в течение рассмотрения и 90 календарных дней после направления окончательного ответа, отклонения или иного завершения, если закон не требует иного срока.</w:t>
-      </w:r>
-    </w:p>
-    <w:p>
-      <w:pPr>
-        <w:jc w:val="both"/>
-      </w:pPr>
-      <w:r>
-        <w:t>5.2. Профиль для повторных обращений подлежит удалению после 90 календарных дней бездействия при отсутствии связанных обращений и иных законных оснований хранения. Доказательства согласия сохраняются лишь в объёме и в течение срока, необходимых для подтверждения законности обработки на соответствующем основании.</w:t>
-      </w:r>
-    </w:p>
-    <w:p>
-      <w:pPr>
-        <w:jc w:val="both"/>
-      </w:pPr>
-      <w:r>
-        <w:t>5.3. Оператор обеспечивает контроль и удаление подконтрольных копий в рабочих чатах, отчётах и файловых хранилищах по окончании срока. Удаление записи из базы само по себе не удаляет сообщения в MAX и скачанные отчёты. Срок резервных копий и архивов передачи проекта — не более 90 календарных дней с создания, если иной срок не установлен законом; их уничтожение контролируется отдельно.</w:t>
-      </w:r>
-    </w:p>
-    <w:p>
-      <w:pPr>
-        <w:jc w:val="both"/>
-      </w:pPr>
-      <w:r>
-        <w:t>5.4. Порядок обработки технических сообщений, восстановления из копий и ограничения, связанные с самостоятельной обработкой данных MAX, изложены в политике. Сохранение данных на другом законном основании допускается только в необходимом объёме; пользователь вправе запросить основание и срок.</w:t>
-      </w:r>
-    </w:p>
-    <w:p>
-      <w:pPr>
-        <w:pStyle w:val="Heading1"/>
-        <w:pageBreakBefore/>
-      </w:pPr>
-      <w:r>
-        <w:t>6. Отзыв и права пользователя</w:t>
-      </w:r>
-    </w:p>
-    <w:p>
-      <w:pPr>
-        <w:jc w:val="both"/>
-      </w:pPr>
-      <w:r>
-        <w:t>6.1. Согласие можно отозвать заявлением на min_digital@adm.kaluga.ru либо по почтовому адресу Оператора. В заявлении указываются требование и сведения для сопоставления заявителя с профилем или обращением. Оператор проверяет личность в необходимом объёме.</w:t>
-      </w:r>
-    </w:p>
-    <w:p>
-      <w:pPr>
-        <w:jc w:val="both"/>
-      </w:pPr>
-      <w:r>
-        <w:t>6.2. При отсутствии другого законного основания Оператор прекращает обработку и уничтожает данные в сроки, установленные законом. Отзыв рассматривается независимо от обычного срока хранения обращения и не отменяет законность обработки, выполненной до его получения.</w:t>
-      </w:r>
-    </w:p>
-    <w:p>
-      <w:pPr>
-        <w:jc w:val="both"/>
-      </w:pPr>
-      <w:r>
-        <w:t>6.3. Пользователь вправе запросить сведения об обработке, потребовать уточнения, блокирования или уничтожения данных, обратиться в Роскомнадзор или суд. Отказ от согласия означает невозможность подачи обращения через данный сервис; остаются доступными официальные каналы соответствующих организаций.</w:t>
-      </w:r>
-    </w:p>
-    <w:p>
-      <w:pPr>
-        <w:pStyle w:val="Heading1"/>
-      </w:pPr>
-      <w:r>
-        <w:t>7. Ограничения согласия</w:t>
-      </w:r>
-    </w:p>
-    <w:p>
-      <w:pPr>
-        <w:jc w:val="both"/>
-      </w:pPr>
-      <w:r>
-        <w:t>7.1. Согласие не разрешает биометрическую идентификацию, публичное распространение данных или использование материалов для сторонней рекламы. Предложенная подписка на каналы MAX добровольна и оформляется пользователем самостоятельно.</w:t>
-      </w:r>
-    </w:p>
-    <w:p>
-      <w:pPr>
-        <w:jc w:val="both"/>
-      </w:pPr>
-      <w:r>
-        <w:t>7.2. Согласие не является универсальным основанием обработки сведений о здоровье и других специальных категорий данных. Не направляйте медицинские документы, копии паспорта, СНИЛС, пароли и избыточные сведения. Если требуется специальный порядок обработки или участие законного представителя, Оператор определяет основание и проверяет необходимые полномочия до такой обработки.</w:t>
-      </w:r>
-    </w:p>
-    <w:p>
-      <w:pPr>
-        <w:pStyle w:val="Heading1"/>
-      </w:pPr>
-      <w:r>
-        <w:t>8. Подтверждение</w:t>
-      </w:r>
-    </w:p>
-    <w:p>
-      <w:pPr>
-        <w:jc w:val="both"/>
-      </w:pPr>
-      <w:r>
-        <w:t>Нажатие кнопки «Даю согласие на обработку персональных данных» после ознакомления с настоящим документом подтверждает согласие. Кнопка «Принимаю пользовательское соглашение» его не заменяет. Новая редакция применяется после публикации и включения Оператором в процедуру подтверждения; изменение условий, требующее нового согласия, подтверждается отдельным действием до следующего обращения.</w:t>
+        <w:t>Оператор, указанный в проектной документации: Министерство цифрового развития Калужской области, ИНН 4027138814, ОГРН 1194027000221. Адрес: 248016, г. Калуга, ул. Ленина, д. 14. Контакт по вопросам обработки данных: min_digital@adm.kaluga.ru. До запуска оператор подтверждает свои полномочия и правовые основания обработки.</w:t>
       </w:r>
     </w:p>
     <w:sectPr>

</xml_diff>

<commit_message>
Use message terminology and publish approved resident rules
</commit_message>
<xml_diff>
--- a/legal/personal-data-consent.docx
+++ b/legal/personal-data-consent.docx
@@ -15,7 +15,7 @@
         <w:jc w:val="both"/>
       </w:pPr>
       <w:r>
-        <w:t>Редакция 3.0 от 29.09.2026. Чат-бот «На связи_регион40».</w:t>
+        <w:t>Редакция 3.1 от 29.09.2026. Чат-бот «На связи_регион40».</w:t>
       </w:r>
     </w:p>
     <w:p>
@@ -31,7 +31,7 @@
         <w:jc w:val="both"/>
       </w:pPr>
       <w:r>
-        <w:t>Профиль жителя с ФИО и телефоном не формируется. Для работы сервиса используются ID MAX, обращение и необходимые служебные сведения. Их состав, цели, получатели и порядок удаления описаны в политике обработки данных. Использование идентификатора не означает полного обезличивания.</w:t>
+        <w:t>Профиль жителя с ФИО и телефоном не формируется. Для работы сервиса используются ID MAX, сообщение и необходимые служебные сведения. Их состав, цели, получатели и порядок удаления описаны в политике обработки данных. Использование идентификатора не означает полного обезличивания.</w:t>
       </w:r>
     </w:p>
     <w:p>

</xml_diff>

<commit_message>
Add verified optional phone per resident message
</commit_message>
<xml_diff>
--- a/legal/personal-data-consent.docx
+++ b/legal/personal-data-consent.docx
@@ -15,7 +15,7 @@
         <w:jc w:val="both"/>
       </w:pPr>
       <w:r>
-        <w:t>Редакция 3.1 от 29.09.2026. Чат-бот «На связи_регион40».</w:t>
+        <w:t>Редакция 3.3 от 29.09.2026. Чат-бот «На связи_регион40».</w:t>
       </w:r>
     </w:p>
     <w:p>
@@ -31,7 +31,7 @@
         <w:jc w:val="both"/>
       </w:pPr>
       <w:r>
-        <w:t>Профиль жителя с ФИО и телефоном не формируется. Для работы сервиса используются ID MAX, сообщение и необходимые служебные сведения. Их состав, цели, получатели и порядок удаления описаны в политике обработки данных. Использование идентификатора не означает полного обезличивания.</w:t>
+        <w:t>Профиль жителя с ФИО и телефоном не формируется. Для работы сервиса используются ID MAX, сообщение, фотографии и необходимые служебные сведения. Телефон можно добровольно передать через отдельную кнопку при проверке одного сообщения: он доступен распределителю и текущему исполнителю для уточнения деталей. Отправка без номера доступна; номер не переносится в следующий черновик. Их состав, цели, получатели и порядок удаления описаны в политике обработки данных. Использование идентификатора не означает полного обезличивания.</w:t>
       </w:r>
     </w:p>
     <w:p>
@@ -39,7 +39,7 @@
         <w:jc w:val="both"/>
       </w:pPr>
       <w:r>
-        <w:t>Не передавайте ФИО, телефоны, документы, личные контакты и фотографии людей. Текст проверяется автоматически, текст и фото дополнительно проверяет сотрудник перед распределением. Автоматическая проверка может ошибаться. Компетентными получателями могут быть также региональные подразделения Социального фонда России и фонда «Защитники Отечества».</w:t>
+        <w:t>Не указывайте ФИО, телефоны, документы и другие личные сведения в тексте и на фото. Исключение — собственный телефон через отдельную кнопку на этапе проверки сообщения. Текст проверяется автоматически, текст и фото дополнительно проверяет сотрудник перед распределением. Автоматическая проверка может ошибаться. Компетентными получателями могут быть также региональные подразделения Социального фонда России и фонда «Защитники Отечества».</w:t>
       </w:r>
     </w:p>
     <w:p>

</xml_diff>

<commit_message>
Allow phone numbers in messages and isolate native contact handling
</commit_message>
<xml_diff>
--- a/legal/personal-data-consent.docx
+++ b/legal/personal-data-consent.docx
@@ -15,7 +15,7 @@
         <w:jc w:val="both"/>
       </w:pPr>
       <w:r>
-        <w:t>Редакция 3.3 от 29.09.2026. Чат-бот «На связи_регион40».</w:t>
+        <w:t>Редакция 3.4 от 30.09.2026. Чат-бот «На связи_регион40».</w:t>
       </w:r>
     </w:p>
     <w:p>
@@ -39,7 +39,7 @@
         <w:jc w:val="both"/>
       </w:pPr>
       <w:r>
-        <w:t>Не указывайте ФИО, телефоны, документы и другие личные сведения в тексте и на фото. Исключение — собственный телефон через отдельную кнопку на этапе проверки сообщения. Текст проверяется автоматически, текст и фото дополнительно проверяет сотрудник перед распределением. Автоматическая проверка может ошибаться. Компетентными получателями могут быть также региональные подразделения Социального фонда России и фонда «Защитники Отечества».</w:t>
+        <w:t>Не указывайте ФИО, документы и другие запрещённые личные сведения в тексте и на фото. Телефон для связи разрешено указать в тексте или передать через отдельную кнопку на этапе проверки сообщения. Номер в тексте виден вместе с текстом сообщения; ограничения доступа к отдельно переданному контакту на него не распространяются. Текст проверяется автоматически, текст и фото дополнительно проверяет сотрудник перед распределением. Автоматическая проверка может ошибаться. Компетентными получателями могут быть также региональные подразделения Социального фонда России и фонда «Защитники Отечества».</w:t>
       </w:r>
     </w:p>
     <w:p>

</xml_diff>

<commit_message>
Use manual draft phone entry and remove mandatory privacy approval
</commit_message>
<xml_diff>
--- a/legal/personal-data-consent.docx
+++ b/legal/personal-data-consent.docx
@@ -15,7 +15,7 @@
         <w:jc w:val="both"/>
       </w:pPr>
       <w:r>
-        <w:t>Редакция 3.4 от 30.09.2026. Чат-бот «На связи_регион40».</w:t>
+        <w:t>Редакция 3.5 от 01.10.2026. Чат-бот «На связи_регион40».</w:t>
       </w:r>
     </w:p>
     <w:p>
@@ -31,7 +31,7 @@
         <w:jc w:val="both"/>
       </w:pPr>
       <w:r>
-        <w:t>Профиль жителя с ФИО и телефоном не формируется. Для работы сервиса используются ID MAX, сообщение, фотографии и необходимые служебные сведения. Телефон можно добровольно передать через отдельную кнопку при проверке одного сообщения: он доступен распределителю и текущему исполнителю для уточнения деталей. Отправка без номера доступна; номер не переносится в следующий черновик. Их состав, цели, получатели и порядок удаления описаны в политике обработки данных. Использование идентификатора не означает полного обезличивания.</w:t>
+        <w:t>Профиль жителя с ФИО и телефоном не формируется. Для работы сервиса используются ID MAX, сообщение, фотографии и необходимые служебные сведения. Телефон можно добровольно ввести вручную после кнопки «Поделиться контактом» при проверке одного сообщения. Проверяется формат, а не принадлежность номера. Номер виден участникам рабочих чатов распределения, исполнения и согласования в полной карточке сообщения и в соответствующих личных рабочих карточках. Отправка без номера доступна; номер не переносится в следующий черновик. Их состав, цели, получатели и порядок удаления описаны в политике обработки данных. Использование идентификатора не означает полного обезличивания.</w:t>
       </w:r>
     </w:p>
     <w:p>
@@ -39,7 +39,7 @@
         <w:jc w:val="both"/>
       </w:pPr>
       <w:r>
-        <w:t>Не указывайте ФИО, документы и другие запрещённые личные сведения в тексте и на фото. Телефон для связи разрешено указать в тексте или передать через отдельную кнопку на этапе проверки сообщения. Номер в тексте виден вместе с текстом сообщения; ограничения доступа к отдельно переданному контакту на него не распространяются. Текст проверяется автоматически, текст и фото дополнительно проверяет сотрудник перед распределением. Автоматическая проверка может ошибаться. Компетентными получателями могут быть также региональные подразделения Социального фонда России и фонда «Защитники Отечества».</w:t>
+        <w:t>Не указывайте ФИО, документы и другие запрещённые личные сведения в тексте и на фото. Телефон для связи разрешено указать в тексте или ввести вручную после кнопки «Поделиться контактом» на этапе проверки сообщения. Номер в тексте виден вместе с текстом сообщения. Отдельно введённый номер также виден участникам рабочих чатов в полной карточке. Текст проверяется автоматически. При обнаружении запрещённых данных сотрудник может отклонить сообщение; отдельное подтверждение проверки перед распределением не требуется. Автоматическая проверка может ошибаться. Компетентными получателями могут быть также региональные подразделения Социального фонда России и фонда «Защитники Отечества».</w:t>
       </w:r>
     </w:p>
     <w:p>

</xml_diff>